<commit_message>
Store daily recap Word us_market_recap_2026-10-28_BJT_us_2026-10-27_final
</commit_message>
<xml_diff>
--- a/reports/us_market_recap_2026-10-28_BJT_us_2026-10-27_final.docx
+++ b/reports/us_market_recap_2026-10-28_BJT_us_2026-10-27_final.docx
@@ -1013,7 +1013,7 @@
                 <w:color w:val="141414"/>
                 <w:sz w:val="16"/>
               </w:rPr>
-              <w:t>102.36 / 99.93 / 8.07万美元</w:t>
+              <w:t>102.32 / 100.25 / 8.04万美元</w:t>
             </w:r>
           </w:p>
         </w:tc>
@@ -1040,7 +1040,7 @@
                 <w:color w:val="141414"/>
                 <w:sz w:val="16"/>
               </w:rPr>
-              <w:t>DXY +0.40% / WTI -1.80% / BTC +0.87%</w:t>
+              <w:t>DXY +0.35% / WTI -1.48% / BTC +0.47%</w:t>
             </w:r>
           </w:p>
         </w:tc>
@@ -3824,7 +3824,7 @@
                 <w:color w:val="141414"/>
                 <w:sz w:val="16"/>
               </w:rPr>
-              <w:t>价格 +10.77%；成交 0.91x均量</w:t>
+              <w:t>价格 +10.77%；成交 0.71x均量</w:t>
             </w:r>
           </w:p>
         </w:tc>
@@ -3935,7 +3935,7 @@
                 <w:color w:val="141414"/>
                 <w:sz w:val="16"/>
               </w:rPr>
-              <w:t>价格 +10.47%；成交 1.11x均量</w:t>
+              <w:t>价格 +10.47%；成交 0.83x均量</w:t>
             </w:r>
           </w:p>
         </w:tc>
@@ -4046,7 +4046,7 @@
                 <w:color w:val="141414"/>
                 <w:sz w:val="16"/>
               </w:rPr>
-              <w:t>价格 +9.42%；成交 0.85x均量</w:t>
+              <w:t>价格 +9.42%；成交 0.77x均量</w:t>
             </w:r>
           </w:p>
         </w:tc>
@@ -4157,7 +4157,7 @@
                 <w:color w:val="141414"/>
                 <w:sz w:val="16"/>
               </w:rPr>
-              <w:t>价格 +7.90%；成交 1.00x均量</w:t>
+              <w:t>价格 +7.90%；成交 0.88x均量</w:t>
             </w:r>
           </w:p>
         </w:tc>
@@ -4268,7 +4268,7 @@
                 <w:color w:val="141414"/>
                 <w:sz w:val="16"/>
               </w:rPr>
-              <w:t>价格 +7.47%；成交 0.86x均量</w:t>
+              <w:t>价格 +7.47%；成交 0.75x均量</w:t>
             </w:r>
           </w:p>
         </w:tc>
@@ -4379,7 +4379,7 @@
                 <w:color w:val="141414"/>
                 <w:sz w:val="16"/>
               </w:rPr>
-              <w:t>价格 +7.34%；成交 0.85x均量</w:t>
+              <w:t>价格 +7.34%；成交 0.74x均量</w:t>
             </w:r>
           </w:p>
         </w:tc>
@@ -4893,7 +4893,7 @@
         <w:t>CRDO</w:t>
       </w:r>
       <w:r>
-        <w:t xml:space="preserve"> +10.77%（成交约0.91x均量）；</w:t>
+        <w:t xml:space="preserve"> +10.77%（成交约0.71x均量）；</w:t>
       </w:r>
       <w:r>
         <w:rPr>
@@ -4902,7 +4902,7 @@
         <w:t>ALAB</w:t>
       </w:r>
       <w:r>
-        <w:t xml:space="preserve"> +10.47%（成交约1.11x均量）；</w:t>
+        <w:t xml:space="preserve"> +10.47%（成交约0.83x均量）；</w:t>
       </w:r>
       <w:r>
         <w:rPr>
@@ -4911,7 +4911,7 @@
         <w:t>APLD</w:t>
       </w:r>
       <w:r>
-        <w:t xml:space="preserve"> +9.42%（成交约0.85x均量）；</w:t>
+        <w:t xml:space="preserve"> +9.42%（成交约0.77x均量）；</w:t>
       </w:r>
       <w:r>
         <w:rPr>
@@ -4920,7 +4920,7 @@
         <w:t>IREN</w:t>
       </w:r>
       <w:r>
-        <w:t xml:space="preserve"> +7.90%（成交约1.00x均量）；</w:t>
+        <w:t xml:space="preserve"> +7.90%（成交约0.88x均量）；</w:t>
       </w:r>
       <w:r>
         <w:rPr>
@@ -4929,7 +4929,7 @@
         <w:t>DELL</w:t>
       </w:r>
       <w:r>
-        <w:t xml:space="preserve"> +7.47%（成交约0.86x均量）；</w:t>
+        <w:t xml:space="preserve"> +7.47%（成交约0.75x均量）；</w:t>
       </w:r>
       <w:r>
         <w:rPr>
@@ -4938,7 +4938,7 @@
         <w:t>SMCI</w:t>
       </w:r>
       <w:r>
-        <w:t xml:space="preserve"> +7.34%（成交约0.85x均量）。这些名字先记录为价格/成交异常，随后核对同日公告、研报、公司交流、行业数据或传闻原始出处；没有证据时保留“待验”，不把涨跌倒推成原因。</w:t>
+        <w:t xml:space="preserve"> +7.34%（成交约0.74x均量）。这些名字先记录为价格/成交异常，随后核对同日公告、研报、公司交流、行业数据或传闻原始出处；没有证据时保留“待验”，不把涨跌倒推成原因。</w:t>
       </w:r>
     </w:p>
     <w:p>
@@ -6257,7 +6257,7 @@
                 <w:color w:val="141414"/>
                 <w:sz w:val="16"/>
               </w:rPr>
-              <w:t>1.04x均量</w:t>
+              <w:t>0.98x均量</w:t>
             </w:r>
           </w:p>
         </w:tc>
@@ -6368,7 +6368,7 @@
                 <w:color w:val="141414"/>
                 <w:sz w:val="16"/>
               </w:rPr>
-              <w:t>1.02x均量</w:t>
+              <w:t>0.86x均量</w:t>
             </w:r>
           </w:p>
         </w:tc>
@@ -6479,7 +6479,7 @@
                 <w:color w:val="141414"/>
                 <w:sz w:val="16"/>
               </w:rPr>
-              <w:t>0.81x均量</w:t>
+              <w:t>0.70x均量</w:t>
             </w:r>
           </w:p>
         </w:tc>
@@ -6590,7 +6590,7 @@
                 <w:color w:val="141414"/>
                 <w:sz w:val="16"/>
               </w:rPr>
-              <w:t>0.99x均量</w:t>
+              <w:t>1.31x均量</w:t>
             </w:r>
           </w:p>
         </w:tc>
@@ -6701,7 +6701,7 @@
                 <w:color w:val="141414"/>
                 <w:sz w:val="16"/>
               </w:rPr>
-              <w:t>1.11x均量</w:t>
+              <w:t>0.89x均量</w:t>
             </w:r>
           </w:p>
         </w:tc>
@@ -6812,7 +6812,7 @@
                 <w:color w:val="141414"/>
                 <w:sz w:val="16"/>
               </w:rPr>
-              <w:t>1.04x均量</w:t>
+              <w:t>0.84x均量</w:t>
             </w:r>
           </w:p>
         </w:tc>
@@ -9221,7 +9221,7 @@
           <w:color w:val="555555"/>
           <w:sz w:val="17"/>
         </w:rPr>
-        <w:t>图：公开期权链异常扫描。来源/口径：Nasdaq public option-chain endpoint；检查时点 2026-10-27T19:36:25-04:00；无执行方向确认。。</w:t>
+        <w:t>图：公开期权链异常扫描。来源/口径：Nasdaq public option-chain endpoint；检查时点 2026-10-27T20:22:33-04:00；无执行方向确认。。</w:t>
       </w:r>
     </w:p>
     <w:p>

</xml_diff>